<commit_message>
Kim11_tema-3-dijital-unite-sonu-sorulari: gorsel alanlarina Shutter onizlemeleri yerlestirildi (2.3 bicimi)
</commit_message>
<xml_diff>
--- a/dijital/Kim11_tema-3-dijital-unite-sonu-sorulari.docx
+++ b/dijital/Kim11_tema-3-dijital-unite-sonu-sorulari.docx
@@ -1068,85 +1068,59 @@
         <w:t xml:space="preserve">) ve çinko oksit (ZnO) parçacıkları kullanılır. Bu parçacıklar iri boyutlu olduklarında ciltte beyaz bir tabaka bırakırken nano boyutta cilt üzerinde şeffaf görünür. Bazı araştırmacılar sprey şeklindeki kremlerin solunabileceğini ve denizlere karışan nanoparçacıkların su canlılarını etkileyebileceğini belirtmektedir.</w:t>
       </w:r>
     </w:p>
-    <w:tbl>
-      <w:tblPr>
-        <w:tblW w:w="9000" w:type="dxa"/>
+    <w:p>
+      <w:pPr>
         <w:jc w:val="center"/>
-        <w:tblBorders>
-          <w:top w:val="single" w:sz="8" w:space="0" w:color="7F7F7F"/>
-          <w:left w:val="single" w:sz="8" w:space="0" w:color="7F7F7F"/>
-          <w:bottom w:val="single" w:sz="8" w:space="0" w:color="7F7F7F"/>
-          <w:right w:val="single" w:sz="8" w:space="0" w:color="7F7F7F"/>
-        </w:tblBorders>
-      </w:tblPr>
-      <w:tblGrid>
-        <w:gridCol w:w="9000"/>
-      </w:tblGrid>
-      <w:tr>
-        <w:tc>
-          <w:tcPr>
-            <w:tcW w:w="9000" w:type="dxa"/>
-            <w:shd w:val="clear" w:color="auto" w:fill="EDEDED"/>
-          </w:tcPr>
-          <w:p>
-            <w:pPr>
-              <w:jc w:val="both"/>
-              <w:rPr>
-                <w:rFonts w:ascii="Times New Roman" w:hAnsi="Times New Roman" w:cs="Times New Roman"/>
-                <w:lang w:val="tr-TR"/>
-              </w:rPr>
-            </w:pPr>
-            <w:r>
-              <w:rPr>
-                <w:rFonts w:ascii="Times New Roman" w:hAnsi="Times New Roman" w:cs="Times New Roman"/>
-                <w:lang w:val="tr-TR"/>
-              </w:rPr>
-              <w:t xml:space="preserve">GÖRSEL ALANI (Shutterstock)</w:t>
-            </w:r>
-          </w:p>
-          <w:p>
-            <w:pPr>
-              <w:jc w:val="both"/>
-              <w:rPr>
-                <w:rFonts w:ascii="Times New Roman" w:hAnsi="Times New Roman" w:cs="Times New Roman"/>
-                <w:lang w:val="tr-TR"/>
-              </w:rPr>
-            </w:pPr>
-            <w:r>
-              <w:rPr>
-                <w:rFonts w:ascii="Times New Roman" w:hAnsi="Times New Roman" w:cs="Times New Roman"/>
-                <w:lang w:val="tr-TR"/>
-              </w:rPr>
-              <w:t xml:space="preserve">Tarif: Sahilde eline güneş kremi süren kişi ya da güneş kremi tüpü.</w:t>
-            </w:r>
-          </w:p>
-          <w:p>
-            <w:pPr>
-              <w:jc w:val="both"/>
-              <w:rPr>
-                <w:rFonts w:ascii="Times New Roman" w:hAnsi="Times New Roman" w:cs="Times New Roman"/>
-                <w:lang w:val="tr-TR"/>
-              </w:rPr>
-            </w:pPr>
-            <w:r>
-              <w:rPr>
-                <w:rFonts w:ascii="Times New Roman" w:hAnsi="Times New Roman" w:cs="Times New Roman"/>
-                <w:lang w:val="tr-TR"/>
-              </w:rPr>
-              <w:t xml:space="preserve">Shutter ID: 2732076933 (fotoğraf) — Woman applies sunscreen to her arm outdoors, orange tube</w:t>
-            </w:r>
-          </w:p>
-        </w:tc>
-      </w:tr>
-    </w:tbl>
+      </w:pPr>
+      <w:r>
+        <w:drawing>
+          <wp:inline xmlns:a="http://schemas.openxmlformats.org/drawingml/2006/main" xmlns:pic="http://schemas.openxmlformats.org/drawingml/2006/picture">
+            <wp:extent cx="3430127" cy="2520000"/>
+            <wp:docPr id="1" name="Picture 1"/>
+            <wp:cNvGraphicFramePr>
+              <a:graphicFrameLocks noChangeAspect="1"/>
+            </wp:cNvGraphicFramePr>
+            <a:graphic>
+              <a:graphicData uri="http://schemas.openxmlformats.org/drawingml/2006/picture">
+                <pic:pic>
+                  <pic:nvPicPr>
+                    <pic:cNvPr id="0" name="2732076933_d.jpg"/>
+                    <pic:cNvPicPr/>
+                  </pic:nvPicPr>
+                  <pic:blipFill>
+                    <a:blip r:embed="rId11"/>
+                    <a:stretch>
+                      <a:fillRect/>
+                    </a:stretch>
+                  </pic:blipFill>
+                  <pic:spPr>
+                    <a:xfrm>
+                      <a:off x="0" y="0"/>
+                      <a:ext cx="3430127" cy="2520000"/>
+                    </a:xfrm>
+                    <a:prstGeom prst="rect"/>
+                  </pic:spPr>
+                </pic:pic>
+              </a:graphicData>
+            </a:graphic>
+          </wp:inline>
+        </w:drawing>
+      </w:r>
+    </w:p>
     <w:p>
       <w:pPr>
-        <w:jc w:val="both"/>
-        <w:rPr>
-          <w:rFonts w:ascii="Times New Roman" w:hAnsi="Times New Roman" w:cs="Times New Roman"/>
-          <w:lang w:val="tr-TR"/>
-        </w:rPr>
-      </w:pPr>
+        <w:jc w:val="center"/>
+      </w:pPr>
+      <w:r>
+        <w:rPr>
+          <w:rFonts w:ascii="Times New Roman" w:hAnsi="Times New Roman" w:cs="Times New Roman"/>
+          <w:b/>
+          <w:bCs/>
+          <w:highlight w:val="yellow"/>
+          <w:lang w:val="tr-TR"/>
+        </w:rPr>
+        <w:t xml:space="preserve">Shutter id: 2732076933</w:t>
+      </w:r>
     </w:p>
     <w:p>
       <w:pPr>

</xml_diff>

<commit_message>
Dijital tema ozetleri: Ingilizce ve okunmayan stok gorseller yerine Turkce cizimler (potansiyel enerji diyagramlari, Le Chatelier ozeti, pH olcegi), tema 3 nanoteknolojiye nanometre olcegi, ekzo/endo gorseline ceviri notu; tema 3 sorularinda gunes kremi fotografi degisti, ogretim amacli notu silindi
</commit_message>
<xml_diff>
--- a/dijital/Kim11_tema-3-dijital-unite-sonu-sorulari.docx
+++ b/dijital/Kim11_tema-3-dijital-unite-sonu-sorulari.docx
@@ -369,33 +369,6 @@
       <w:r>
         <w:rPr>
           <w:rFonts w:ascii="Times New Roman" w:hAnsi="Times New Roman" w:cs="Times New Roman"/>
-          <w:b/>
-          <w:bCs/>
-          <w:highlight w:val="yellow"/>
-          <w:lang w:val="tr-TR"/>
-        </w:rPr>
-        <w:t xml:space="preserve">NOT: </w:t>
-      </w:r>
-      <w:r>
-        <w:rPr>
-          <w:rFonts w:ascii="Times New Roman" w:hAnsi="Times New Roman" w:cs="Times New Roman"/>
-          <w:highlight w:val="yellow"/>
-          <w:lang w:val="tr-TR"/>
-        </w:rPr>
-        <w:t xml:space="preserve">Tablodaki veriler öğretim amaçlı olarak düzenlenmiştir.</w:t>
-      </w:r>
-    </w:p>
-    <w:p>
-      <w:pPr>
-        <w:jc w:val="both"/>
-        <w:rPr>
-          <w:rFonts w:ascii="Times New Roman" w:hAnsi="Times New Roman" w:cs="Times New Roman"/>
-          <w:lang w:val="tr-TR"/>
-        </w:rPr>
-      </w:pPr>
-      <w:r>
-        <w:rPr>
-          <w:rFonts w:ascii="Times New Roman" w:hAnsi="Times New Roman" w:cs="Times New Roman"/>
           <w:lang w:val="tr-TR"/>
         </w:rPr>
         <w:t xml:space="preserve">1. Deneydeki bağımsız, bağımlı ve kontrol değişkenlerini yazınız.</w:t>
@@ -1075,7 +1048,7 @@
       <w:r>
         <w:drawing>
           <wp:inline xmlns:a="http://schemas.openxmlformats.org/drawingml/2006/main" xmlns:pic="http://schemas.openxmlformats.org/drawingml/2006/picture">
-            <wp:extent cx="3430127" cy="2520000"/>
+            <wp:extent cx="1575000" cy="2520000"/>
             <wp:docPr id="1" name="Picture 1"/>
             <wp:cNvGraphicFramePr>
               <a:graphicFrameLocks noChangeAspect="1"/>
@@ -1084,11 +1057,11 @@
               <a:graphicData uri="http://schemas.openxmlformats.org/drawingml/2006/picture">
                 <pic:pic>
                   <pic:nvPicPr>
-                    <pic:cNvPr id="0" name="2732076933_d.jpg"/>
+                    <pic:cNvPr id="0" name="2534917847_d.jpg"/>
                     <pic:cNvPicPr/>
                   </pic:nvPicPr>
                   <pic:blipFill>
-                    <a:blip r:embed="rId11"/>
+                    <a:blip r:embed="rId12"/>
                     <a:stretch>
                       <a:fillRect/>
                     </a:stretch>
@@ -1096,7 +1069,7 @@
                   <pic:spPr>
                     <a:xfrm>
                       <a:off x="0" y="0"/>
-                      <a:ext cx="3430127" cy="2520000"/>
+                      <a:ext cx="1575000" cy="2520000"/>
                     </a:xfrm>
                     <a:prstGeom prst="rect"/>
                   </pic:spPr>
@@ -1119,7 +1092,7 @@
           <w:highlight w:val="yellow"/>
           <w:lang w:val="tr-TR"/>
         </w:rPr>
-        <w:t xml:space="preserve">Shutter id: 2732076933</w:t>
+        <w:t xml:space="preserve">Shutter id: 2534917847</w:t>
       </w:r>
     </w:p>
     <w:p>

</xml_diff>